<commit_message>
docs: update proposal and panduan document artifacts
Refresh generated DOCX/PDF exports and kemanfaatan graphics used for
proposal and operational documentation packages.
</commit_message>
<xml_diff>
--- a/docs/Timeline Pengembangan Arumanis.docx
+++ b/docs/Timeline Pengembangan Arumanis.docx
@@ -15,7 +15,6 @@
         <w:rPr>
           <w:b/>
           <w:bCs/>
-          <w:color w:val="1F4E79"/>
           <w:sz w:val="28"/>
           <w:szCs w:val="28"/>
         </w:rPr>
@@ -28,7 +27,6 @@
         <w:rPr>
           <w:b/>
           <w:bCs/>
-          <w:color w:val="1F4E79"/>
           <w:sz w:val="40"/>
           <w:szCs w:val="40"/>
         </w:rPr>
@@ -37,7 +35,6 @@
         <w:rPr>
           <w:b/>
           <w:bCs/>
-          <w:color w:val="1F4E79"/>
           <w:sz w:val="40"/>
           <w:szCs w:val="40"/>
         </w:rPr>
@@ -118,9 +115,13 @@
       <w:pPr>
         <w:pStyle w:val="Heading1"/>
         <w:spacing w:before="0"/>
-      </w:pPr>
-      <w:r>
         <w:rPr>
+          <w:color w:val="auto"/>
+        </w:rPr>
+      </w:pPr>
+      <w:r>
+        <w:rPr>
+          <w:color w:val="auto"/>
           <w:sz w:val="22"/>
           <w:szCs w:val="22"/>
         </w:rPr>
@@ -143,7 +144,6 @@
         <w:rPr>
           <w:i/>
           <w:iCs/>
-          <w:color w:val="666666"/>
         </w:rPr>
         <w:t>Timeline direkonstruksi dari LINEAGE.md, rancang bangun inovasi, dan changelog platform. Repo produksi aktif (arumanis, apiamis) mencatat commit intensif mulai 2025; fase 2024 mencerminkan warisan pilot sebelum migrasi SPA + BFF + Laravel API.</w:t>
       </w:r>
@@ -152,9 +152,13 @@
       <w:pPr>
         <w:pStyle w:val="Heading2"/>
         <w:spacing w:before="0" w:after="200"/>
-      </w:pPr>
-      <w:r>
         <w:rPr>
+          <w:color w:val="auto"/>
+        </w:rPr>
+      </w:pPr>
+      <w:r>
+        <w:rPr>
+          <w:color w:val="auto"/>
           <w:sz w:val="22"/>
           <w:szCs w:val="22"/>
         </w:rPr>
@@ -219,7 +223,7 @@
               <w:bottom w:val="single" w:sz="1" w:space="0" w:color="000000"/>
               <w:right w:val="single" w:sz="1" w:space="0" w:color="000000"/>
             </w:tcBorders>
-            <w:shd w:val="clear" w:color="auto" w:fill="D9E2F3"/>
+            <w:shd w:val="clear" w:color="auto" w:fill="E59EDC" w:themeFill="accent5" w:themeFillTint="66"/>
             <w:tcMar>
               <w:top w:w="50" w:type="dxa"/>
               <w:left w:w="80" w:type="dxa"/>
@@ -252,7 +256,7 @@
               <w:bottom w:val="single" w:sz="1" w:space="0" w:color="000000"/>
               <w:right w:val="single" w:sz="1" w:space="0" w:color="000000"/>
             </w:tcBorders>
-            <w:shd w:val="clear" w:color="auto" w:fill="D9E2F3"/>
+            <w:shd w:val="clear" w:color="auto" w:fill="E59EDC" w:themeFill="accent5" w:themeFillTint="66"/>
             <w:tcMar>
               <w:top w:w="50" w:type="dxa"/>
               <w:left w:w="80" w:type="dxa"/>
@@ -286,7 +290,7 @@
               <w:bottom w:val="single" w:sz="1" w:space="0" w:color="000000"/>
               <w:right w:val="single" w:sz="1" w:space="0" w:color="000000"/>
             </w:tcBorders>
-            <w:shd w:val="clear" w:color="auto" w:fill="D9E2F3"/>
+            <w:shd w:val="clear" w:color="auto" w:fill="E59EDC" w:themeFill="accent5" w:themeFillTint="66"/>
             <w:tcMar>
               <w:top w:w="50" w:type="dxa"/>
               <w:left w:w="80" w:type="dxa"/>
@@ -320,7 +324,7 @@
               <w:bottom w:val="single" w:sz="1" w:space="0" w:color="000000"/>
               <w:right w:val="single" w:sz="1" w:space="0" w:color="000000"/>
             </w:tcBorders>
-            <w:shd w:val="clear" w:color="auto" w:fill="D9E2F3"/>
+            <w:shd w:val="clear" w:color="auto" w:fill="E59EDC" w:themeFill="accent5" w:themeFillTint="66"/>
             <w:tcMar>
               <w:top w:w="50" w:type="dxa"/>
               <w:left w:w="80" w:type="dxa"/>
@@ -354,7 +358,7 @@
               <w:bottom w:val="single" w:sz="1" w:space="0" w:color="000000"/>
               <w:right w:val="single" w:sz="1" w:space="0" w:color="000000"/>
             </w:tcBorders>
-            <w:shd w:val="clear" w:color="auto" w:fill="D9E2F3"/>
+            <w:shd w:val="clear" w:color="auto" w:fill="E59EDC" w:themeFill="accent5" w:themeFillTint="66"/>
             <w:tcMar>
               <w:top w:w="50" w:type="dxa"/>
               <w:left w:w="80" w:type="dxa"/>
@@ -390,29 +394,30 @@
               <w:bottom w:val="single" w:sz="1" w:space="0" w:color="000000"/>
               <w:right w:val="single" w:sz="1" w:space="0" w:color="000000"/>
             </w:tcBorders>
-            <w:tcMar>
-              <w:top w:w="50" w:type="dxa"/>
-              <w:left w:w="80" w:type="dxa"/>
-              <w:bottom w:w="50" w:type="dxa"/>
-              <w:right w:w="80" w:type="dxa"/>
-            </w:tcMar>
-          </w:tcPr>
-          <w:p>
-            <w:pPr>
-              <w:spacing w:after="0" w:line="276" w:lineRule="auto"/>
-            </w:pPr>
-          </w:p>
-        </w:tc>
-        <w:tc>
-          <w:tcPr>
-            <w:tcW w:w="300" w:type="dxa"/>
-            <w:tcBorders>
-              <w:top w:val="single" w:sz="1" w:space="0" w:color="000000"/>
-              <w:left w:val="single" w:sz="1" w:space="0" w:color="000000"/>
-              <w:bottom w:val="single" w:sz="1" w:space="0" w:color="000000"/>
-              <w:right w:val="single" w:sz="1" w:space="0" w:color="000000"/>
-            </w:tcBorders>
-            <w:shd w:val="clear" w:color="auto" w:fill="D9E2F3"/>
+            <w:shd w:val="clear" w:color="auto" w:fill="E59EDC" w:themeFill="accent5" w:themeFillTint="66"/>
+            <w:tcMar>
+              <w:top w:w="50" w:type="dxa"/>
+              <w:left w:w="80" w:type="dxa"/>
+              <w:bottom w:w="50" w:type="dxa"/>
+              <w:right w:w="80" w:type="dxa"/>
+            </w:tcMar>
+          </w:tcPr>
+          <w:p>
+            <w:pPr>
+              <w:spacing w:after="0" w:line="276" w:lineRule="auto"/>
+            </w:pPr>
+          </w:p>
+        </w:tc>
+        <w:tc>
+          <w:tcPr>
+            <w:tcW w:w="300" w:type="dxa"/>
+            <w:tcBorders>
+              <w:top w:val="single" w:sz="1" w:space="0" w:color="000000"/>
+              <w:left w:val="single" w:sz="1" w:space="0" w:color="000000"/>
+              <w:bottom w:val="single" w:sz="1" w:space="0" w:color="000000"/>
+              <w:right w:val="single" w:sz="1" w:space="0" w:color="000000"/>
+            </w:tcBorders>
+            <w:shd w:val="clear" w:color="auto" w:fill="E59EDC" w:themeFill="accent5" w:themeFillTint="66"/>
             <w:tcMar>
               <w:top w:w="50" w:type="dxa"/>
               <w:left w:w="80" w:type="dxa"/>
@@ -445,7 +450,7 @@
               <w:bottom w:val="single" w:sz="1" w:space="0" w:color="000000"/>
               <w:right w:val="single" w:sz="1" w:space="0" w:color="000000"/>
             </w:tcBorders>
-            <w:shd w:val="clear" w:color="auto" w:fill="D9E2F3"/>
+            <w:shd w:val="clear" w:color="auto" w:fill="E59EDC" w:themeFill="accent5" w:themeFillTint="66"/>
             <w:tcMar>
               <w:top w:w="50" w:type="dxa"/>
               <w:left w:w="80" w:type="dxa"/>
@@ -478,7 +483,7 @@
               <w:bottom w:val="single" w:sz="1" w:space="0" w:color="000000"/>
               <w:right w:val="single" w:sz="1" w:space="0" w:color="000000"/>
             </w:tcBorders>
-            <w:shd w:val="clear" w:color="auto" w:fill="D9E2F3"/>
+            <w:shd w:val="clear" w:color="auto" w:fill="E59EDC" w:themeFill="accent5" w:themeFillTint="66"/>
             <w:tcMar>
               <w:top w:w="50" w:type="dxa"/>
               <w:left w:w="80" w:type="dxa"/>
@@ -511,7 +516,7 @@
               <w:bottom w:val="single" w:sz="1" w:space="0" w:color="000000"/>
               <w:right w:val="single" w:sz="1" w:space="0" w:color="000000"/>
             </w:tcBorders>
-            <w:shd w:val="clear" w:color="auto" w:fill="D9E2F3"/>
+            <w:shd w:val="clear" w:color="auto" w:fill="E59EDC" w:themeFill="accent5" w:themeFillTint="66"/>
             <w:tcMar>
               <w:top w:w="50" w:type="dxa"/>
               <w:left w:w="80" w:type="dxa"/>
@@ -544,7 +549,7 @@
               <w:bottom w:val="single" w:sz="1" w:space="0" w:color="000000"/>
               <w:right w:val="single" w:sz="1" w:space="0" w:color="000000"/>
             </w:tcBorders>
-            <w:shd w:val="clear" w:color="auto" w:fill="D9E2F3"/>
+            <w:shd w:val="clear" w:color="auto" w:fill="E59EDC" w:themeFill="accent5" w:themeFillTint="66"/>
             <w:tcMar>
               <w:top w:w="50" w:type="dxa"/>
               <w:left w:w="80" w:type="dxa"/>
@@ -577,7 +582,7 @@
               <w:bottom w:val="single" w:sz="1" w:space="0" w:color="000000"/>
               <w:right w:val="single" w:sz="1" w:space="0" w:color="000000"/>
             </w:tcBorders>
-            <w:shd w:val="clear" w:color="auto" w:fill="D9E2F3"/>
+            <w:shd w:val="clear" w:color="auto" w:fill="E59EDC" w:themeFill="accent5" w:themeFillTint="66"/>
             <w:tcMar>
               <w:top w:w="50" w:type="dxa"/>
               <w:left w:w="80" w:type="dxa"/>
@@ -610,7 +615,7 @@
               <w:bottom w:val="single" w:sz="1" w:space="0" w:color="000000"/>
               <w:right w:val="single" w:sz="1" w:space="0" w:color="000000"/>
             </w:tcBorders>
-            <w:shd w:val="clear" w:color="auto" w:fill="D9E2F3"/>
+            <w:shd w:val="clear" w:color="auto" w:fill="E59EDC" w:themeFill="accent5" w:themeFillTint="66"/>
             <w:tcMar>
               <w:top w:w="50" w:type="dxa"/>
               <w:left w:w="80" w:type="dxa"/>
@@ -643,7 +648,7 @@
               <w:bottom w:val="single" w:sz="1" w:space="0" w:color="000000"/>
               <w:right w:val="single" w:sz="1" w:space="0" w:color="000000"/>
             </w:tcBorders>
-            <w:shd w:val="clear" w:color="auto" w:fill="D9E2F3"/>
+            <w:shd w:val="clear" w:color="auto" w:fill="E59EDC" w:themeFill="accent5" w:themeFillTint="66"/>
             <w:tcMar>
               <w:top w:w="50" w:type="dxa"/>
               <w:left w:w="80" w:type="dxa"/>
@@ -676,7 +681,7 @@
               <w:bottom w:val="single" w:sz="1" w:space="0" w:color="000000"/>
               <w:right w:val="single" w:sz="1" w:space="0" w:color="000000"/>
             </w:tcBorders>
-            <w:shd w:val="clear" w:color="auto" w:fill="D9E2F3"/>
+            <w:shd w:val="clear" w:color="auto" w:fill="E59EDC" w:themeFill="accent5" w:themeFillTint="66"/>
             <w:tcMar>
               <w:top w:w="50" w:type="dxa"/>
               <w:left w:w="80" w:type="dxa"/>
@@ -709,7 +714,7 @@
               <w:bottom w:val="single" w:sz="1" w:space="0" w:color="000000"/>
               <w:right w:val="single" w:sz="1" w:space="0" w:color="000000"/>
             </w:tcBorders>
-            <w:shd w:val="clear" w:color="auto" w:fill="D9E2F3"/>
+            <w:shd w:val="clear" w:color="auto" w:fill="E59EDC" w:themeFill="accent5" w:themeFillTint="66"/>
             <w:tcMar>
               <w:top w:w="50" w:type="dxa"/>
               <w:left w:w="80" w:type="dxa"/>
@@ -742,7 +747,7 @@
               <w:bottom w:val="single" w:sz="1" w:space="0" w:color="000000"/>
               <w:right w:val="single" w:sz="1" w:space="0" w:color="000000"/>
             </w:tcBorders>
-            <w:shd w:val="clear" w:color="auto" w:fill="D9E2F3"/>
+            <w:shd w:val="clear" w:color="auto" w:fill="E59EDC" w:themeFill="accent5" w:themeFillTint="66"/>
             <w:tcMar>
               <w:top w:w="50" w:type="dxa"/>
               <w:left w:w="80" w:type="dxa"/>
@@ -775,7 +780,7 @@
               <w:bottom w:val="single" w:sz="1" w:space="0" w:color="000000"/>
               <w:right w:val="single" w:sz="1" w:space="0" w:color="000000"/>
             </w:tcBorders>
-            <w:shd w:val="clear" w:color="auto" w:fill="D9E2F3"/>
+            <w:shd w:val="clear" w:color="auto" w:fill="E59EDC" w:themeFill="accent5" w:themeFillTint="66"/>
             <w:tcMar>
               <w:top w:w="50" w:type="dxa"/>
               <w:left w:w="80" w:type="dxa"/>
@@ -808,7 +813,7 @@
               <w:bottom w:val="single" w:sz="1" w:space="0" w:color="000000"/>
               <w:right w:val="single" w:sz="1" w:space="0" w:color="000000"/>
             </w:tcBorders>
-            <w:shd w:val="clear" w:color="auto" w:fill="D9E2F3"/>
+            <w:shd w:val="clear" w:color="auto" w:fill="E59EDC" w:themeFill="accent5" w:themeFillTint="66"/>
             <w:tcMar>
               <w:top w:w="50" w:type="dxa"/>
               <w:left w:w="80" w:type="dxa"/>
@@ -841,7 +846,7 @@
               <w:bottom w:val="single" w:sz="1" w:space="0" w:color="000000"/>
               <w:right w:val="single" w:sz="1" w:space="0" w:color="000000"/>
             </w:tcBorders>
-            <w:shd w:val="clear" w:color="auto" w:fill="D9E2F3"/>
+            <w:shd w:val="clear" w:color="auto" w:fill="E59EDC" w:themeFill="accent5" w:themeFillTint="66"/>
             <w:tcMar>
               <w:top w:w="50" w:type="dxa"/>
               <w:left w:w="80" w:type="dxa"/>
@@ -874,7 +879,7 @@
               <w:bottom w:val="single" w:sz="1" w:space="0" w:color="000000"/>
               <w:right w:val="single" w:sz="1" w:space="0" w:color="000000"/>
             </w:tcBorders>
-            <w:shd w:val="clear" w:color="auto" w:fill="D9E2F3"/>
+            <w:shd w:val="clear" w:color="auto" w:fill="E59EDC" w:themeFill="accent5" w:themeFillTint="66"/>
             <w:tcMar>
               <w:top w:w="50" w:type="dxa"/>
               <w:left w:w="80" w:type="dxa"/>
@@ -907,7 +912,7 @@
               <w:bottom w:val="single" w:sz="1" w:space="0" w:color="000000"/>
               <w:right w:val="single" w:sz="1" w:space="0" w:color="000000"/>
             </w:tcBorders>
-            <w:shd w:val="clear" w:color="auto" w:fill="D9E2F3"/>
+            <w:shd w:val="clear" w:color="auto" w:fill="E59EDC" w:themeFill="accent5" w:themeFillTint="66"/>
             <w:tcMar>
               <w:top w:w="50" w:type="dxa"/>
               <w:left w:w="80" w:type="dxa"/>
@@ -2909,7 +2914,6 @@
         <w:rPr>
           <w:i/>
           <w:iCs/>
-          <w:color w:val="666666"/>
           <w:sz w:val="20"/>
           <w:szCs w:val="20"/>
         </w:rPr>
@@ -2925,9 +2929,13 @@
       <w:pPr>
         <w:pStyle w:val="Heading2"/>
         <w:spacing w:before="0" w:after="200"/>
-      </w:pPr>
-      <w:r>
         <w:rPr>
+          <w:color w:val="auto"/>
+        </w:rPr>
+      </w:pPr>
+      <w:r>
+        <w:rPr>
+          <w:color w:val="auto"/>
           <w:sz w:val="22"/>
           <w:szCs w:val="22"/>
         </w:rPr>
@@ -2967,7 +2975,7 @@
               <w:bottom w:val="single" w:sz="1" w:space="0" w:color="CCCCCC"/>
               <w:right w:val="single" w:sz="1" w:space="0" w:color="CCCCCC"/>
             </w:tcBorders>
-            <w:shd w:val="clear" w:color="auto" w:fill="D5E8F0"/>
+            <w:shd w:val="clear" w:color="auto" w:fill="E59EDC" w:themeFill="accent5" w:themeFillTint="66"/>
             <w:tcMar>
               <w:top w:w="80" w:type="dxa"/>
               <w:left w:w="120" w:type="dxa"/>
@@ -2997,7 +3005,7 @@
               <w:bottom w:val="single" w:sz="1" w:space="0" w:color="CCCCCC"/>
               <w:right w:val="single" w:sz="1" w:space="0" w:color="CCCCCC"/>
             </w:tcBorders>
-            <w:shd w:val="clear" w:color="auto" w:fill="D5E8F0"/>
+            <w:shd w:val="clear" w:color="auto" w:fill="E59EDC" w:themeFill="accent5" w:themeFillTint="66"/>
             <w:tcMar>
               <w:top w:w="80" w:type="dxa"/>
               <w:left w:w="120" w:type="dxa"/>
@@ -3027,7 +3035,7 @@
               <w:bottom w:val="single" w:sz="1" w:space="0" w:color="CCCCCC"/>
               <w:right w:val="single" w:sz="1" w:space="0" w:color="CCCCCC"/>
             </w:tcBorders>
-            <w:shd w:val="clear" w:color="auto" w:fill="D5E8F0"/>
+            <w:shd w:val="clear" w:color="auto" w:fill="E59EDC" w:themeFill="accent5" w:themeFillTint="66"/>
             <w:tcMar>
               <w:top w:w="80" w:type="dxa"/>
               <w:left w:w="120" w:type="dxa"/>
@@ -3367,9 +3375,13 @@
       <w:pPr>
         <w:pStyle w:val="Heading2"/>
         <w:spacing w:before="0" w:after="200"/>
-      </w:pPr>
-      <w:r>
         <w:rPr>
+          <w:color w:val="auto"/>
+        </w:rPr>
+      </w:pPr>
+      <w:r>
+        <w:rPr>
+          <w:color w:val="auto"/>
           <w:sz w:val="22"/>
           <w:szCs w:val="22"/>
         </w:rPr>
@@ -3409,7 +3421,7 @@
               <w:bottom w:val="single" w:sz="1" w:space="0" w:color="CCCCCC"/>
               <w:right w:val="single" w:sz="1" w:space="0" w:color="CCCCCC"/>
             </w:tcBorders>
-            <w:shd w:val="clear" w:color="auto" w:fill="D5E8F0"/>
+            <w:shd w:val="clear" w:color="auto" w:fill="E59EDC" w:themeFill="accent5" w:themeFillTint="66"/>
             <w:tcMar>
               <w:top w:w="80" w:type="dxa"/>
               <w:left w:w="120" w:type="dxa"/>
@@ -3439,7 +3451,7 @@
               <w:bottom w:val="single" w:sz="1" w:space="0" w:color="CCCCCC"/>
               <w:right w:val="single" w:sz="1" w:space="0" w:color="CCCCCC"/>
             </w:tcBorders>
-            <w:shd w:val="clear" w:color="auto" w:fill="D5E8F0"/>
+            <w:shd w:val="clear" w:color="auto" w:fill="E59EDC" w:themeFill="accent5" w:themeFillTint="66"/>
             <w:tcMar>
               <w:top w:w="80" w:type="dxa"/>
               <w:left w:w="120" w:type="dxa"/>
@@ -3469,7 +3481,7 @@
               <w:bottom w:val="single" w:sz="1" w:space="0" w:color="CCCCCC"/>
               <w:right w:val="single" w:sz="1" w:space="0" w:color="CCCCCC"/>
             </w:tcBorders>
-            <w:shd w:val="clear" w:color="auto" w:fill="D5E8F0"/>
+            <w:shd w:val="clear" w:color="auto" w:fill="E59EDC" w:themeFill="accent5" w:themeFillTint="66"/>
             <w:tcMar>
               <w:top w:w="80" w:type="dxa"/>
               <w:left w:w="120" w:type="dxa"/>
@@ -3499,7 +3511,7 @@
               <w:bottom w:val="single" w:sz="1" w:space="0" w:color="CCCCCC"/>
               <w:right w:val="single" w:sz="1" w:space="0" w:color="CCCCCC"/>
             </w:tcBorders>
-            <w:shd w:val="clear" w:color="auto" w:fill="D5E8F0"/>
+            <w:shd w:val="clear" w:color="auto" w:fill="E59EDC" w:themeFill="accent5" w:themeFillTint="66"/>
             <w:tcMar>
               <w:top w:w="80" w:type="dxa"/>
               <w:left w:w="120" w:type="dxa"/>
@@ -3846,9 +3858,13 @@
       <w:pPr>
         <w:pStyle w:val="Heading1"/>
         <w:spacing w:before="0"/>
-      </w:pPr>
-      <w:r>
         <w:rPr>
+          <w:color w:val="auto"/>
+        </w:rPr>
+      </w:pPr>
+      <w:r>
+        <w:rPr>
+          <w:color w:val="auto"/>
           <w:sz w:val="22"/>
           <w:szCs w:val="22"/>
         </w:rPr>
@@ -3860,9 +3876,13 @@
       <w:pPr>
         <w:pStyle w:val="Heading2"/>
         <w:spacing w:before="0" w:after="200"/>
-      </w:pPr>
-      <w:r>
         <w:rPr>
+          <w:color w:val="auto"/>
+        </w:rPr>
+      </w:pPr>
+      <w:r>
+        <w:rPr>
+          <w:color w:val="auto"/>
           <w:sz w:val="22"/>
           <w:szCs w:val="22"/>
         </w:rPr>
@@ -3882,9 +3902,13 @@
       <w:pPr>
         <w:pStyle w:val="Heading3"/>
         <w:spacing w:before="0" w:after="200"/>
-      </w:pPr>
-      <w:r>
         <w:rPr>
+          <w:color w:val="auto"/>
+        </w:rPr>
+      </w:pPr>
+      <w:r>
+        <w:rPr>
+          <w:color w:val="auto"/>
           <w:sz w:val="22"/>
           <w:szCs w:val="22"/>
         </w:rPr>
@@ -3960,9 +3984,13 @@
       <w:pPr>
         <w:pStyle w:val="Heading3"/>
         <w:spacing w:before="0" w:after="200"/>
-      </w:pPr>
-      <w:r>
         <w:rPr>
+          <w:color w:val="auto"/>
+        </w:rPr>
+      </w:pPr>
+      <w:r>
+        <w:rPr>
+          <w:color w:val="auto"/>
           <w:sz w:val="22"/>
           <w:szCs w:val="22"/>
         </w:rPr>
@@ -4013,9 +4041,13 @@
       <w:pPr>
         <w:pStyle w:val="Heading2"/>
         <w:spacing w:before="0" w:after="200"/>
-      </w:pPr>
-      <w:r>
         <w:rPr>
+          <w:color w:val="auto"/>
+        </w:rPr>
+      </w:pPr>
+      <w:r>
+        <w:rPr>
+          <w:color w:val="auto"/>
           <w:sz w:val="22"/>
           <w:szCs w:val="22"/>
         </w:rPr>
@@ -4035,9 +4067,13 @@
       <w:pPr>
         <w:pStyle w:val="Heading3"/>
         <w:spacing w:before="0" w:after="200"/>
-      </w:pPr>
-      <w:r>
         <w:rPr>
+          <w:color w:val="auto"/>
+        </w:rPr>
+      </w:pPr>
+      <w:r>
+        <w:rPr>
+          <w:color w:val="auto"/>
           <w:sz w:val="22"/>
           <w:szCs w:val="22"/>
         </w:rPr>
@@ -4116,9 +4152,13 @@
       <w:pPr>
         <w:pStyle w:val="Heading3"/>
         <w:spacing w:before="0" w:after="200"/>
-      </w:pPr>
-      <w:r>
         <w:rPr>
+          <w:color w:val="auto"/>
+        </w:rPr>
+      </w:pPr>
+      <w:r>
+        <w:rPr>
+          <w:color w:val="auto"/>
           <w:sz w:val="22"/>
           <w:szCs w:val="22"/>
         </w:rPr>
@@ -4176,9 +4216,13 @@
       <w:pPr>
         <w:pStyle w:val="Heading2"/>
         <w:spacing w:before="0" w:after="200"/>
-      </w:pPr>
-      <w:r>
         <w:rPr>
+          <w:color w:val="auto"/>
+        </w:rPr>
+      </w:pPr>
+      <w:r>
+        <w:rPr>
+          <w:color w:val="auto"/>
           <w:sz w:val="22"/>
           <w:szCs w:val="22"/>
         </w:rPr>
@@ -4198,9 +4242,13 @@
       <w:pPr>
         <w:pStyle w:val="Heading3"/>
         <w:spacing w:before="0" w:after="200"/>
-      </w:pPr>
-      <w:r>
         <w:rPr>
+          <w:color w:val="auto"/>
+        </w:rPr>
+      </w:pPr>
+      <w:r>
+        <w:rPr>
+          <w:color w:val="auto"/>
           <w:sz w:val="22"/>
           <w:szCs w:val="22"/>
         </w:rPr>
@@ -4289,9 +4337,13 @@
       <w:pPr>
         <w:pStyle w:val="Heading3"/>
         <w:spacing w:before="0" w:after="200"/>
-      </w:pPr>
-      <w:r>
         <w:rPr>
+          <w:color w:val="auto"/>
+        </w:rPr>
+      </w:pPr>
+      <w:r>
+        <w:rPr>
+          <w:color w:val="auto"/>
           <w:sz w:val="22"/>
           <w:szCs w:val="22"/>
         </w:rPr>
@@ -4342,9 +4394,13 @@
       <w:pPr>
         <w:pStyle w:val="Heading2"/>
         <w:spacing w:before="0" w:after="200"/>
-      </w:pPr>
-      <w:r>
         <w:rPr>
+          <w:color w:val="auto"/>
+        </w:rPr>
+      </w:pPr>
+      <w:r>
+        <w:rPr>
+          <w:color w:val="auto"/>
           <w:sz w:val="22"/>
           <w:szCs w:val="22"/>
         </w:rPr>
@@ -4364,9 +4420,13 @@
       <w:pPr>
         <w:pStyle w:val="Heading3"/>
         <w:spacing w:before="0" w:after="200"/>
-      </w:pPr>
-      <w:r>
         <w:rPr>
+          <w:color w:val="auto"/>
+        </w:rPr>
+      </w:pPr>
+      <w:r>
+        <w:rPr>
+          <w:color w:val="auto"/>
           <w:sz w:val="22"/>
           <w:szCs w:val="22"/>
         </w:rPr>
@@ -4456,9 +4516,13 @@
       <w:pPr>
         <w:pStyle w:val="Heading3"/>
         <w:spacing w:before="0" w:after="200"/>
-      </w:pPr>
-      <w:r>
         <w:rPr>
+          <w:color w:val="auto"/>
+        </w:rPr>
+      </w:pPr>
+      <w:r>
+        <w:rPr>
+          <w:color w:val="auto"/>
           <w:sz w:val="22"/>
           <w:szCs w:val="22"/>
         </w:rPr>
@@ -4522,9 +4586,13 @@
       <w:pPr>
         <w:pStyle w:val="Heading1"/>
         <w:spacing w:before="0"/>
-      </w:pPr>
-      <w:r>
         <w:rPr>
+          <w:color w:val="auto"/>
+        </w:rPr>
+      </w:pPr>
+      <w:r>
+        <w:rPr>
+          <w:color w:val="auto"/>
           <w:sz w:val="22"/>
           <w:szCs w:val="22"/>
         </w:rPr>
@@ -4562,7 +4630,7 @@
               <w:bottom w:val="single" w:sz="1" w:space="0" w:color="CCCCCC"/>
               <w:right w:val="single" w:sz="1" w:space="0" w:color="CCCCCC"/>
             </w:tcBorders>
-            <w:shd w:val="clear" w:color="auto" w:fill="D5E8F0"/>
+            <w:shd w:val="clear" w:color="auto" w:fill="E59EDC" w:themeFill="accent5" w:themeFillTint="66"/>
             <w:tcMar>
               <w:top w:w="80" w:type="dxa"/>
               <w:left w:w="120" w:type="dxa"/>
@@ -4592,7 +4660,7 @@
               <w:bottom w:val="single" w:sz="1" w:space="0" w:color="CCCCCC"/>
               <w:right w:val="single" w:sz="1" w:space="0" w:color="CCCCCC"/>
             </w:tcBorders>
-            <w:shd w:val="clear" w:color="auto" w:fill="D5E8F0"/>
+            <w:shd w:val="clear" w:color="auto" w:fill="E59EDC" w:themeFill="accent5" w:themeFillTint="66"/>
             <w:tcMar>
               <w:top w:w="80" w:type="dxa"/>
               <w:left w:w="120" w:type="dxa"/>
@@ -5016,9 +5084,13 @@
       <w:pPr>
         <w:pStyle w:val="Heading1"/>
         <w:spacing w:before="0"/>
-      </w:pPr>
-      <w:r>
         <w:rPr>
+          <w:color w:val="auto"/>
+        </w:rPr>
+      </w:pPr>
+      <w:r>
+        <w:rPr>
+          <w:color w:val="auto"/>
           <w:sz w:val="22"/>
           <w:szCs w:val="22"/>
         </w:rPr>
@@ -5058,7 +5130,7 @@
               <w:bottom w:val="single" w:sz="1" w:space="0" w:color="CCCCCC"/>
               <w:right w:val="single" w:sz="1" w:space="0" w:color="CCCCCC"/>
             </w:tcBorders>
-            <w:shd w:val="clear" w:color="auto" w:fill="D5E8F0"/>
+            <w:shd w:val="clear" w:color="auto" w:fill="E59EDC" w:themeFill="accent5" w:themeFillTint="66"/>
             <w:tcMar>
               <w:top w:w="80" w:type="dxa"/>
               <w:left w:w="120" w:type="dxa"/>
@@ -5088,7 +5160,7 @@
               <w:bottom w:val="single" w:sz="1" w:space="0" w:color="CCCCCC"/>
               <w:right w:val="single" w:sz="1" w:space="0" w:color="CCCCCC"/>
             </w:tcBorders>
-            <w:shd w:val="clear" w:color="auto" w:fill="D5E8F0"/>
+            <w:shd w:val="clear" w:color="auto" w:fill="E59EDC" w:themeFill="accent5" w:themeFillTint="66"/>
             <w:tcMar>
               <w:top w:w="80" w:type="dxa"/>
               <w:left w:w="120" w:type="dxa"/>
@@ -5118,7 +5190,7 @@
               <w:bottom w:val="single" w:sz="1" w:space="0" w:color="CCCCCC"/>
               <w:right w:val="single" w:sz="1" w:space="0" w:color="CCCCCC"/>
             </w:tcBorders>
-            <w:shd w:val="clear" w:color="auto" w:fill="D5E8F0"/>
+            <w:shd w:val="clear" w:color="auto" w:fill="E59EDC" w:themeFill="accent5" w:themeFillTint="66"/>
             <w:tcMar>
               <w:top w:w="80" w:type="dxa"/>
               <w:left w:w="120" w:type="dxa"/>
@@ -5459,7 +5531,6 @@
         <w:rPr>
           <w:i/>
           <w:iCs/>
-          <w:color w:val="888888"/>
           <w:sz w:val="20"/>
           <w:szCs w:val="20"/>
         </w:rPr>
@@ -5600,19 +5671,10 @@
       <w:rPr>
         <w:b/>
         <w:bCs/>
-        <w:color w:val="1F4E79"/>
         <w:sz w:val="20"/>
         <w:szCs w:val="20"/>
       </w:rPr>
       <w:t>Timeline Pengembangan ARUMANIS</w:t>
-    </w:r>
-    <w:r>
-      <w:rPr>
-        <w:color w:val="888888"/>
-        <w:sz w:val="20"/>
-        <w:szCs w:val="20"/>
-      </w:rPr>
-      <w:t xml:space="preserve">  |  Jan–Apr 2024</w:t>
     </w:r>
   </w:p>
 </w:hdr>
@@ -6437,6 +6499,50 @@
       <w:szCs w:val="20"/>
     </w:rPr>
   </w:style>
+  <w:style w:type="paragraph" w:styleId="Header">
+    <w:name w:val="header"/>
+    <w:basedOn w:val="Normal"/>
+    <w:link w:val="HeaderChar"/>
+    <w:uiPriority w:val="99"/>
+    <w:unhideWhenUsed/>
+    <w:rsid w:val="007A0B3C"/>
+    <w:pPr>
+      <w:tabs>
+        <w:tab w:val="center" w:pos="4513"/>
+        <w:tab w:val="right" w:pos="9026"/>
+      </w:tabs>
+      <w:spacing w:after="0" w:line="240" w:lineRule="auto"/>
+    </w:pPr>
+  </w:style>
+  <w:style w:type="character" w:customStyle="1" w:styleId="HeaderChar">
+    <w:name w:val="Header Char"/>
+    <w:basedOn w:val="DefaultParagraphFont"/>
+    <w:link w:val="Header"/>
+    <w:uiPriority w:val="99"/>
+    <w:rsid w:val="007A0B3C"/>
+  </w:style>
+  <w:style w:type="paragraph" w:styleId="Footer">
+    <w:name w:val="footer"/>
+    <w:basedOn w:val="Normal"/>
+    <w:link w:val="FooterChar"/>
+    <w:uiPriority w:val="99"/>
+    <w:unhideWhenUsed/>
+    <w:rsid w:val="007A0B3C"/>
+    <w:pPr>
+      <w:tabs>
+        <w:tab w:val="center" w:pos="4513"/>
+        <w:tab w:val="right" w:pos="9026"/>
+      </w:tabs>
+      <w:spacing w:after="0" w:line="240" w:lineRule="auto"/>
+    </w:pPr>
+  </w:style>
+  <w:style w:type="character" w:customStyle="1" w:styleId="FooterChar">
+    <w:name w:val="Footer Char"/>
+    <w:basedOn w:val="DefaultParagraphFont"/>
+    <w:link w:val="Footer"/>
+    <w:uiPriority w:val="99"/>
+    <w:rsid w:val="007A0B3C"/>
+  </w:style>
 </w:styles>
 </file>
 

</xml_diff>